<commit_message>
Update sources to recent (2022-2025) scholarship and add Bible citations
Replace older references with sources published within the last five
years (Meirinhos et al., 2022; Men & Tkalac Verčič, 2023;
Nadales-Gallego et al., 2025) and incorporate two NIV Bible citations
(Galatians 5:13; Proverbs 15:22) with matching in-text references.

Co-Authored-By: Claude Opus 4.8 <noreply@anthropic.com>
Claude-Session: https://claude.ai/code/session_01EPBLWSB47696DLt3yZoVqG
</commit_message>
<xml_diff>
--- a/SHUDE_Internal_Communication_Plan.docx
+++ b/SHUDE_Internal_Communication_Plan.docx
@@ -147,7 +147,7 @@
           <w:sz w:val="24"/>
           <w:szCs w:val="24"/>
         </w:rPr>
-        <w:t xml:space="preserve">August 13, 2026</w:t>
+        <w:t xml:space="preserve">August 15, 2026</w:t>
       </w:r>
     </w:p>
     <w:p>
@@ -199,7 +199,7 @@
           <w:sz w:val="24"/>
           <w:szCs w:val="24"/>
         </w:rPr>
-        <w:t xml:space="preserve">SHUDE is a volunteer-driven nonprofit organization that collects, refurbishes, and distributes footwear to children and student-athletes who lack access to proper shoes. Through initiatives such as its community SHUDE Drives and the Shooting Stars program, the organization equips young people with the footwear they need for health, mobility, and confidence. I serve SHUDE as a volunteer, assisting with event coordination and building relationships with the families and students we serve. My connection to the organization is personal: like the volunteers interviewed during the foundation phase of this project, I stayed because of the conversations I had and the visible impact of watching a child receive a new pair of shoes.</w:t>
+        <w:t xml:space="preserve">SHUDE is a volunteer-driven nonprofit organization that collects, refurbishes, and distributes footwear to children and student-athletes who lack access to proper shoes. Through initiatives such as its community SHUDE Drives and the Shooting Stars program, the organization equips young people with the footwear they need for health, mobility, and confidence. I serve SHUDE as a volunteer, assisting with event coordination and building relationships with the families and students we serve. My connection to the organization is personal: like the volunteers interviewed during the foundation phase of this project, I stayed because of the conversations I had and the visible impact of watching a child receive a new pair of shoes. In this sense, SHUDE’s volunteers live out the biblical call to “serve one another humbly in love” (New International Version Bible, 1978/2011, Galatians 5:13).</w:t>
       </w:r>
     </w:p>
     <w:p>
@@ -275,22 +275,22 @@
           <w:sz w:val="24"/>
           <w:szCs w:val="24"/>
         </w:rPr>
-        <w:t xml:space="preserve">From these, two issues are prioritized: first, volunteer disengagement and attrition caused by communication gaps between events; and second, inconsistent onboarding that produces role confusion and inefficiency. Research supports addressing these gaps. Ruck and Welch (2012) found that employees value regular, two-way internal communication and that its absence erodes engagement. Men (2014) demonstrated that symmetrical, transparent communication improves employee trust and outcomes, while Welch and Jackson (2007) argued that a stakeholder approach to internal communication builds commitment across an organization. Supporting ideas that strengthen the message include SHUDE’s existing storytelling culture, which can be repurposed into structured channels, and the low-cost digital tools now available to small nonprofits (Quirke, 2008).</w:t>
-      </w:r>
-    </w:p>
-    <w:p>
-      <w:pPr>
-        <w:spacing w:after="0" w:line="480"/>
-        <w:ind w:firstLine="720"/>
-        <w:jc w:val="left"/>
-      </w:pPr>
-      <w:r>
-        <w:rPr>
-          <w:rFonts w:ascii="Times New Roman" w:cs="Times New Roman" w:eastAsia="Times New Roman" w:hAnsi="Times New Roman"/>
-          <w:sz w:val="24"/>
-          <w:szCs w:val="24"/>
-        </w:rPr>
-        <w:t xml:space="preserve">The message answers the five Ws and an H. What: SHUDE will adopt a coordinated internal communication plan built around a central hub and structured onboarding; for volunteers, this means clearer information and a stronger sense of connection. Why: consistent internal communication is the right decision because it drives engagement and retention (Ruck &amp; Welch, 2012), and it is needed now as the volunteer base continues to grow. Where: the decision originates with SHUDE’s volunteer leadership and affects every program site and drive, and more information will be available through the new communication hub. When: the plan rolls out over the coming quarter, beginning with the digital hub and onboarding materials. How: leadership developed the plan collaboratively using volunteer feedback, and it will be implemented in phases, with communication flowing two ways between leaders and volunteers. Who: SHUDE’s volunteer directors lead the effort, and it impacts all volunteers, coordinators, and the students the organization serves.</w:t>
+        <w:t xml:space="preserve">From these, two issues are prioritized: first, volunteer disengagement and attrition caused by communication gaps between events; and second, inconsistent onboarding that produces role confusion and inefficiency. Research supports addressing these gaps. Meirinhos et al. (2022) found that employee involvement and genuine two-way internal communication strengthen organizational commitment. Men and Tkalac Verčič (2023) demonstrated that transparent, responsive internal communication is a direct driver of employee engagement, while a systematic review by Nadales-Gallego et al. (2025) confirmed that consistent internal communication is essential to engagement, particularly as workforces grow more dispersed. Supporting ideas that strengthen the message include SHUDE’s existing storytelling culture, which can be repurposed into structured channels, and the low-cost digital tools now available to small nonprofits.</w:t>
+      </w:r>
+    </w:p>
+    <w:p>
+      <w:pPr>
+        <w:spacing w:after="0" w:line="480"/>
+        <w:ind w:firstLine="720"/>
+        <w:jc w:val="left"/>
+      </w:pPr>
+      <w:r>
+        <w:rPr>
+          <w:rFonts w:ascii="Times New Roman" w:cs="Times New Roman" w:eastAsia="Times New Roman" w:hAnsi="Times New Roman"/>
+          <w:sz w:val="24"/>
+          <w:szCs w:val="24"/>
+        </w:rPr>
+        <w:t xml:space="preserve">The message answers the five Ws and an H. What: SHUDE will adopt a coordinated internal communication plan built around a central hub and structured onboarding; for volunteers, this means clearer information and a stronger sense of connection. Why: consistent internal communication is the right decision because it drives engagement and retention (Meirinhos et al., 2022), and it is needed now as the volunteer base continues to grow. Where: the decision originates with SHUDE’s volunteer leadership and affects every program site and drive, and more information will be available through the new communication hub. When: the plan rolls out over the coming quarter, beginning with the digital hub and onboarding materials. How: leadership developed the plan collaboratively using volunteer feedback, and it will be implemented in phases, with communication flowing two ways between leaders and volunteers. Who: SHUDE’s volunteer directors lead the effort, and it impacts all volunteers, coordinators, and the students the organization serves.</w:t>
       </w:r>
     </w:p>
     <w:p>
@@ -321,7 +321,7 @@
           <w:sz w:val="24"/>
           <w:szCs w:val="24"/>
         </w:rPr>
-        <w:t xml:space="preserve">Having defined the business need—retaining engaged volunteers and onboarding them effectively—the plan uses two internal communication strategies to meet it. The first strategy is to establish two-way, symmetrical communication through a centralized digital hub, ensuring information flows consistently between leadership and volunteers rather than only at events (Men, 2014). The second strategy is to build a structured onboarding and recognition system that welcomes, orients, and continually affirms volunteers, treating them as valued internal stakeholders (Welch &amp; Jackson, 2007). Together, these strategies convert SHUDE’s relational strengths into repeatable, sustainable processes. Each strategy is tied to a specific, measurable objective: the first aims to increase volunteer retention and the frequency of between-event contact, and the second aims to raise onboarding completion and reduce early attrition among first-year volunteers. Framing the strategies around clear objectives keeps the plan accountable and gives leadership a concrete standard against which to judge success.</w:t>
+        <w:t xml:space="preserve">Having defined the business need—retaining engaged volunteers and onboarding them effectively—the plan uses two internal communication strategies to meet it. The first strategy is to establish two-way, symmetrical communication through a centralized digital hub, ensuring information flows consistently between leadership and volunteers rather than only at events (Men &amp; Tkalac Verčič, 2023). The second strategy is to build a structured onboarding and recognition system that welcomes, orients, and continually affirms volunteers, treating them as valued internal stakeholders (Meirinhos et al., 2022). This collaborative, consultative approach also reflects the biblical principle that “plans fail for lack of counsel, but with many advisers they succeed” (New International Version Bible, 1978/2011, Proverbs 15:22). Together, these strategies convert SHUDE’s relational strengths into repeatable, sustainable processes. Each strategy is tied to a specific, measurable objective: the first aims to increase volunteer retention and the frequency of between-event contact, and the second aims to raise onboarding completion and reduce early attrition among first-year volunteers. Framing the strategies around clear objectives keeps the plan accountable and gives leadership a concrete standard against which to judge success.</w:t>
       </w:r>
     </w:p>
     <w:p>
@@ -398,7 +398,7 @@
           <w:sz w:val="24"/>
           <w:szCs w:val="24"/>
         </w:rPr>
-        <w:t xml:space="preserve">Progress will be measured with a mix of quantitative and qualitative techniques. Quantitative measures include volunteer retention and attrition rates, event attendance, newsletter open and click-through rates, group-app engagement, and onboarding completion rates. Qualitative measures include short pulse surveys administered before and after rollout and brief volunteer interviews. A volunteer satisfaction score, gathered quarterly, will track sentiment over time. Comparing these metrics against the baseline data collected during the foundation phase will reveal whether communication gaps are closing and whether engagement is rising (Ruck &amp; Welch, 2012). To keep the measures meaningful, leadership will set specific targets—for example, a defined percentage increase in retention over the first year and a majority of new volunteers completing the onboarding packet within their first month—so that progress can be judged against concrete benchmarks rather than impressions alone.</w:t>
+        <w:t xml:space="preserve">Progress will be measured with a mix of quantitative and qualitative techniques. Quantitative measures include volunteer retention and attrition rates, event attendance, newsletter open and click-through rates, group-app engagement, and onboarding completion rates. Qualitative measures include short pulse surveys administered before and after rollout and brief volunteer interviews. A volunteer satisfaction score, gathered quarterly, will track sentiment over time. Comparing these metrics against the baseline data collected during the foundation phase will reveal whether communication gaps are closing and whether engagement is rising (Men &amp; Tkalac Verčič, 2023). To keep the measures meaningful, leadership will set specific targets—for example, a defined percentage increase in retention over the first year and a majority of new volunteers completing the onboarding packet within their first month—so that progress can be judged against concrete benchmarks rather than impressions alone.</w:t>
       </w:r>
     </w:p>
     <w:p>
@@ -497,7 +497,7 @@
           <w:sz w:val="24"/>
           <w:szCs w:val="24"/>
         </w:rPr>
-        <w:t xml:space="preserve">Men, L. R. (2014). Why leadership matters to internal communication: Linking transformational leadership, symmetrical communication, and employee outcomes. </w:t>
+        <w:t xml:space="preserve">Meirinhos, G., Cardoso, A., Silva, R., Rêgo, R., &amp; Oliveira, M. (2022). Employee involvement and commitment in internal communication. </w:t>
       </w:r>
       <w:r>
         <w:rPr>
@@ -507,7 +507,7 @@
           <w:sz w:val="24"/>
           <w:szCs w:val="24"/>
         </w:rPr>
-        <w:t xml:space="preserve">Journal of Public Relations Research, 26</w:t>
+        <w:t xml:space="preserve">Social Sciences, 11</w:t>
       </w:r>
       <w:r>
         <w:rPr>
@@ -517,7 +517,7 @@
           <w:sz w:val="24"/>
           <w:szCs w:val="24"/>
         </w:rPr>
-        <w:t xml:space="preserve">(3), 256–279. https://doi.org/10.1080/1062726X.2014.908719</w:t>
+        <w:t xml:space="preserve">(9), Article 423. https://doi.org/10.3390/socsci11090423</w:t>
       </w:r>
     </w:p>
     <w:p>
@@ -533,7 +533,7 @@
           <w:sz w:val="24"/>
           <w:szCs w:val="24"/>
         </w:rPr>
-        <w:t xml:space="preserve">Quirke, B. (2008). </w:t>
+        <w:t xml:space="preserve">Men, L. R., &amp; Tkalac Verčič, A. (2023). Redefining the link between internal communication and employee engagement. </w:t>
       </w:r>
       <w:r>
         <w:rPr>
@@ -543,7 +543,7 @@
           <w:sz w:val="24"/>
           <w:szCs w:val="24"/>
         </w:rPr>
-        <w:t xml:space="preserve">Making the connections: Using internal communication to turn strategy into action</w:t>
+        <w:t xml:space="preserve">Public Relations Review, 49</w:t>
       </w:r>
       <w:r>
         <w:rPr>
@@ -553,7 +553,7 @@
           <w:sz w:val="24"/>
           <w:szCs w:val="24"/>
         </w:rPr>
-        <w:t xml:space="preserve"> (2nd ed.). Gower Publishing.</w:t>
+        <w:t xml:space="preserve">(1), Article 102279. https://doi.org/10.1016/j.pubrev.2022.102279</w:t>
       </w:r>
     </w:p>
     <w:p>
@@ -569,7 +569,7 @@
           <w:sz w:val="24"/>
           <w:szCs w:val="24"/>
         </w:rPr>
-        <w:t xml:space="preserve">Ruck, K., &amp; Welch, M. (2012). Valuing internal communication: Management and employee perspectives. </w:t>
+        <w:t xml:space="preserve">Nadales-Gallego, A., Galindo-Reyes, F., &amp; Garrido-Moreno, A. (2025). Connecting internal communication and employee engagement in organisation: A systematic literature review. </w:t>
       </w:r>
       <w:r>
         <w:rPr>
@@ -579,7 +579,7 @@
           <w:sz w:val="24"/>
           <w:szCs w:val="24"/>
         </w:rPr>
-        <w:t xml:space="preserve">Public Relations Review, 38</w:t>
+        <w:t xml:space="preserve">SAGE Open, 15</w:t>
       </w:r>
       <w:r>
         <w:rPr>
@@ -589,7 +589,7 @@
           <w:sz w:val="24"/>
           <w:szCs w:val="24"/>
         </w:rPr>
-        <w:t xml:space="preserve">(2), 294–302. https://doi.org/10.1016/j.pubrev.2011.12.016</w:t>
+        <w:t xml:space="preserve">(4). https://doi.org/10.1177/21582440251399773</w:t>
       </w:r>
     </w:p>
     <w:p>
@@ -605,27 +605,7 @@
           <w:sz w:val="24"/>
           <w:szCs w:val="24"/>
         </w:rPr>
-        <w:t xml:space="preserve">Welch, M., &amp; Jackson, P. R. (2007). Rethinking internal communication: A stakeholder approach. </w:t>
-      </w:r>
-      <w:r>
-        <w:rPr>
-          <w:rFonts w:ascii="Times New Roman" w:cs="Times New Roman" w:eastAsia="Times New Roman" w:hAnsi="Times New Roman"/>
-          <w:i/>
-          <w:iCs/>
-          <w:sz w:val="24"/>
-          <w:szCs w:val="24"/>
-        </w:rPr>
-        <w:t xml:space="preserve">Corporate Communications: An International Journal, 12</w:t>
-      </w:r>
-      <w:r>
-        <w:rPr>
-          <w:rFonts w:ascii="Times New Roman" w:cs="Times New Roman" w:eastAsia="Times New Roman" w:hAnsi="Times New Roman"/>
-          <w:i w:val="false"/>
-          <w:iCs w:val="false"/>
-          <w:sz w:val="24"/>
-          <w:szCs w:val="24"/>
-        </w:rPr>
-        <w:t xml:space="preserve">(2), 177–198. https://doi.org/10.1108/13563280710744847</w:t>
+        <w:t xml:space="preserve">New International Version Bible. (2011). Zondervan. (Original work published 1978)</w:t>
       </w:r>
     </w:p>
     <w:sectPr>

</xml_diff>